<commit_message>
Complete Task 1 data logging and report assets
</commit_message>
<xml_diff>
--- a/MATLAB Coursework 2  Word Template.docx
+++ b/MATLAB Coursework 2  Word Template.docx
@@ -2,7 +2,10 @@
 <file path=word/document.xml><?xml version="1.0" encoding="utf-8"?>
 <w:document xmlns:wpc="http://schemas.microsoft.com/office/word/2010/wordprocessingCanvas" xmlns:cx="http://schemas.microsoft.com/office/drawing/2014/chartex" xmlns:cx1="http://schemas.microsoft.com/office/drawing/2015/9/8/chartex" xmlns:cx2="http://schemas.microsoft.com/office/drawing/2015/10/21/chartex" xmlns:cx3="http://schemas.microsoft.com/office/drawing/2016/5/9/chartex" xmlns:cx4="http://schemas.microsoft.com/office/drawing/2016/5/10/chartex" xmlns:cx5="http://schemas.microsoft.com/office/drawing/2016/5/11/chartex" xmlns:cx6="http://schemas.microsoft.com/office/drawing/2016/5/12/chartex" xmlns:cx7="http://schemas.microsoft.com/office/drawing/2016/5/13/chartex" xmlns:cx8="http://schemas.microsoft.com/office/drawing/2016/5/14/chartex" xmlns:mc="http://schemas.openxmlformats.org/markup-compatibility/2006" xmlns:aink="http://schemas.microsoft.com/office/drawing/2016/ink" xmlns:am3d="http://schemas.microsoft.com/office/drawing/2017/model3d" xmlns:o="urn:schemas-microsoft-com:office:office" xmlns:oel="http://schemas.microsoft.com/office/2019/extlst" xmlns:r="http://schemas.openxmlformats.org/officeDocument/2006/relationships" xmlns:m="http://schemas.openxmlformats.org/officeDocument/2006/math" xmlns:v="urn:schemas-microsoft-com:vml" xmlns:wp14="http://schemas.microsoft.com/office/word/2010/wordprocessingDrawing" xmlns:wp="http://schemas.openxmlformats.org/drawingml/2006/wordprocessingDrawing" xmlns:w10="urn:schemas-microsoft-com:office:word" xmlns:w="http://schemas.openxmlformats.org/wordprocessingml/2006/main" xmlns:w14="http://schemas.microsoft.com/office/word/2010/wordml" xmlns:w15="http://schemas.microsoft.com/office/word/2012/wordml" xmlns:w16cex="http://schemas.microsoft.com/office/word/2018/wordml/cex" xmlns:w16cid="http://schemas.microsoft.com/office/word/2016/wordml/cid" xmlns:w16="http://schemas.microsoft.com/office/word/2018/wordml" xmlns:w16du="http://schemas.microsoft.com/office/word/2023/wordml/word16du" xmlns:w16sdtdh="http://schemas.microsoft.com/office/word/2020/wordml/sdtdatahash" xmlns:w16sdtfl="http://schemas.microsoft.com/office/word/2024/wordml/sdtformatlock" xmlns:w16se="http://schemas.microsoft.com/office/word/2015/wordml/symex" xmlns:wpg="http://schemas.microsoft.com/office/word/2010/wordprocessingGroup" xmlns:wpi="http://schemas.microsoft.com/office/word/2010/wordprocessingInk" xmlns:wne="http://schemas.microsoft.com/office/word/2006/wordml" xmlns:wps="http://schemas.microsoft.com/office/word/2010/wordprocessingShape" mc:Ignorable="w14 w15 w16se w16cid w16 w16cex w16sdtdh w16sdtfl w16du wp14">
   <w:body>
-    <w:p/>
+    <w:p>
+      <w:bookmarkStart w:id="0" w:name="_Hlk228796165"/>
+      <w:bookmarkEnd w:id="0"/>
+    </w:p>
     <w:p/>
     <w:p/>
     <w:p/>
@@ -18,8 +21,10 @@
     <w:p>
       <w:pPr>
         <w:rPr>
+          <w:rFonts w:hint="eastAsia"/>
           <w:b/>
           <w:bCs/>
+          <w:lang w:eastAsia="zh-CN"/>
         </w:rPr>
       </w:pPr>
       <w:r>
@@ -27,14 +32,25 @@
           <w:b/>
           <w:bCs/>
         </w:rPr>
-        <w:t>Author: Add your name</w:t>
+        <w:t xml:space="preserve">Author: </w:t>
+      </w:r>
+      <w:r>
+        <w:rPr>
+          <w:rFonts w:hint="eastAsia"/>
+          <w:b/>
+          <w:bCs/>
+          <w:lang w:eastAsia="zh-CN"/>
+        </w:rPr>
+        <w:t>Mingchen Sun</w:t>
       </w:r>
     </w:p>
     <w:p>
       <w:pPr>
         <w:rPr>
+          <w:rFonts w:hint="eastAsia"/>
           <w:b/>
           <w:bCs/>
+          <w:lang w:eastAsia="zh-CN"/>
         </w:rPr>
       </w:pPr>
       <w:r>
@@ -42,14 +58,25 @@
           <w:b/>
           <w:bCs/>
         </w:rPr>
-        <w:t>Student ID: Put your ID number here</w:t>
+        <w:t>Student ID:</w:t>
+      </w:r>
+      <w:r>
+        <w:rPr>
+          <w:rFonts w:hint="eastAsia"/>
+          <w:b/>
+          <w:bCs/>
+          <w:lang w:eastAsia="zh-CN"/>
+        </w:rPr>
+        <w:t xml:space="preserve"> 20718523</w:t>
       </w:r>
     </w:p>
     <w:p>
       <w:pPr>
         <w:rPr>
+          <w:rFonts w:hint="eastAsia"/>
           <w:b/>
           <w:bCs/>
+          <w:lang w:eastAsia="zh-CN"/>
         </w:rPr>
       </w:pPr>
       <w:r>
@@ -61,10 +88,12 @@
       </w:r>
       <w:r>
         <w:rPr>
+          <w:rFonts w:hint="eastAsia"/>
           <w:b/>
           <w:bCs/>
+          <w:lang w:eastAsia="zh-CN"/>
         </w:rPr>
-        <w:t>Add submission date here</w:t>
+        <w:t>4 / 5 / 2026</w:t>
       </w:r>
     </w:p>
     <w:p/>
@@ -75,6 +104,7 @@
       <w:pPr>
         <w:rPr>
           <w:highlight w:val="cyan"/>
+          <w:lang w:eastAsia="zh-CN"/>
         </w:rPr>
       </w:pPr>
       <w:r>
@@ -87,32 +117,294 @@
     <w:p>
       <w:pPr>
         <w:rPr>
-          <w:color w:val="808080" w:themeColor="background1" w:themeShade="80"/>
+          <w:b/>
+          <w:bCs/>
+          <w:lang w:eastAsia="zh-CN"/>
         </w:rPr>
       </w:pPr>
       <w:r>
         <w:rPr>
-          <w:color w:val="808080" w:themeColor="background1" w:themeShade="80"/>
+          <w:rFonts w:hint="eastAsia"/>
+          <w:b/>
+          <w:bCs/>
+          <w:lang w:eastAsia="zh-CN"/>
         </w:rPr>
         <w:lastRenderedPageBreak/>
-        <w:t>For questions which require you to write text (i.e., descriptive sentences), or include images and graphs, please add them to the Word submission template.</w:t>
+        <w:t>Task 1:</w:t>
       </w:r>
     </w:p>
     <w:p>
       <w:pPr>
-        <w:spacing w:line="259" w:lineRule="auto"/>
-        <w:jc w:val="both"/>
         <w:rPr>
-          <w:color w:val="000000" w:themeColor="text1"/>
+          <w:rFonts w:hint="eastAsia"/>
+          <w:b/>
+          <w:bCs/>
+          <w:lang w:eastAsia="zh-CN"/>
+        </w:rPr>
+      </w:pPr>
+      <w:r>
+        <w:rPr>
+          <w:b/>
+          <w:bCs/>
+          <w:noProof/>
+          <w:lang w:eastAsia="zh-CN"/>
+        </w:rPr>
+        <w:drawing>
+          <wp:anchor distT="0" distB="0" distL="114300" distR="114300" simplePos="0" relativeHeight="251658240" behindDoc="1" locked="0" layoutInCell="1" allowOverlap="1" wp14:anchorId="797E2325" wp14:editId="60C24010">
+            <wp:simplePos x="0" y="0"/>
+            <wp:positionH relativeFrom="column">
+              <wp:posOffset>3436958</wp:posOffset>
+            </wp:positionH>
+            <wp:positionV relativeFrom="paragraph">
+              <wp:posOffset>6985</wp:posOffset>
+            </wp:positionV>
+            <wp:extent cx="2456815" cy="3274695"/>
+            <wp:effectExtent l="0" t="0" r="635" b="1905"/>
+            <wp:wrapTight wrapText="bothSides">
+              <wp:wrapPolygon edited="0">
+                <wp:start x="0" y="0"/>
+                <wp:lineTo x="0" y="21487"/>
+                <wp:lineTo x="21438" y="21487"/>
+                <wp:lineTo x="21438" y="0"/>
+                <wp:lineTo x="0" y="0"/>
+              </wp:wrapPolygon>
+            </wp:wrapTight>
+            <wp:docPr id="1354706838" name="Picture 4"/>
+            <wp:cNvGraphicFramePr>
+              <a:graphicFrameLocks xmlns:a="http://schemas.openxmlformats.org/drawingml/2006/main" noChangeAspect="1"/>
+            </wp:cNvGraphicFramePr>
+            <a:graphic xmlns:a="http://schemas.openxmlformats.org/drawingml/2006/main">
+              <a:graphicData uri="http://schemas.openxmlformats.org/drawingml/2006/picture">
+                <pic:pic xmlns:pic="http://schemas.openxmlformats.org/drawingml/2006/picture">
+                  <pic:nvPicPr>
+                    <pic:cNvPr id="0" name="Picture 2"/>
+                    <pic:cNvPicPr>
+                      <a:picLocks noChangeAspect="1" noChangeArrowheads="1"/>
+                    </pic:cNvPicPr>
+                  </pic:nvPicPr>
+                  <pic:blipFill>
+                    <a:blip r:embed="rId8" cstate="print">
+                      <a:extLst>
+                        <a:ext uri="{28A0092B-C50C-407E-A947-70E740481C1C}">
+                          <a14:useLocalDpi xmlns:a14="http://schemas.microsoft.com/office/drawing/2010/main" val="0"/>
+                        </a:ext>
+                      </a:extLst>
+                    </a:blip>
+                    <a:srcRect/>
+                    <a:stretch>
+                      <a:fillRect/>
+                    </a:stretch>
+                  </pic:blipFill>
+                  <pic:spPr bwMode="auto">
+                    <a:xfrm>
+                      <a:off x="0" y="0"/>
+                      <a:ext cx="2456815" cy="3274695"/>
+                    </a:xfrm>
+                    <a:prstGeom prst="rect">
+                      <a:avLst/>
+                    </a:prstGeom>
+                    <a:noFill/>
+                    <a:ln>
+                      <a:noFill/>
+                    </a:ln>
+                  </pic:spPr>
+                </pic:pic>
+              </a:graphicData>
+            </a:graphic>
+            <wp14:sizeRelH relativeFrom="margin">
+              <wp14:pctWidth>0</wp14:pctWidth>
+            </wp14:sizeRelH>
+            <wp14:sizeRelV relativeFrom="margin">
+              <wp14:pctHeight>0</wp14:pctHeight>
+            </wp14:sizeRelV>
+          </wp:anchor>
+        </w:drawing>
+      </w:r>
+      <w:r>
+        <w:rPr>
+          <w:b/>
+          <w:bCs/>
+          <w:noProof/>
+          <w:lang w:eastAsia="zh-CN"/>
+        </w:rPr>
+        <w:drawing>
+          <wp:anchor distT="0" distB="0" distL="114300" distR="114300" simplePos="0" relativeHeight="251659264" behindDoc="1" locked="0" layoutInCell="1" allowOverlap="1" wp14:anchorId="1D74588F" wp14:editId="7E3F62E7">
+            <wp:simplePos x="0" y="0"/>
+            <wp:positionH relativeFrom="column">
+              <wp:posOffset>0</wp:posOffset>
+            </wp:positionH>
+            <wp:positionV relativeFrom="paragraph">
+              <wp:posOffset>635</wp:posOffset>
+            </wp:positionV>
+            <wp:extent cx="2435860" cy="3248660"/>
+            <wp:effectExtent l="0" t="0" r="2540" b="8890"/>
+            <wp:wrapTight wrapText="bothSides">
+              <wp:wrapPolygon edited="0">
+                <wp:start x="0" y="0"/>
+                <wp:lineTo x="0" y="21532"/>
+                <wp:lineTo x="21454" y="21532"/>
+                <wp:lineTo x="21454" y="0"/>
+                <wp:lineTo x="0" y="0"/>
+              </wp:wrapPolygon>
+            </wp:wrapTight>
+            <wp:docPr id="130165147" name="Picture 3"/>
+            <wp:cNvGraphicFramePr>
+              <a:graphicFrameLocks xmlns:a="http://schemas.openxmlformats.org/drawingml/2006/main" noChangeAspect="1"/>
+            </wp:cNvGraphicFramePr>
+            <a:graphic xmlns:a="http://schemas.openxmlformats.org/drawingml/2006/main">
+              <a:graphicData uri="http://schemas.openxmlformats.org/drawingml/2006/picture">
+                <pic:pic xmlns:pic="http://schemas.openxmlformats.org/drawingml/2006/picture">
+                  <pic:nvPicPr>
+                    <pic:cNvPr id="0" name="Picture 1"/>
+                    <pic:cNvPicPr>
+                      <a:picLocks noChangeAspect="1" noChangeArrowheads="1"/>
+                    </pic:cNvPicPr>
+                  </pic:nvPicPr>
+                  <pic:blipFill>
+                    <a:blip r:embed="rId9" cstate="print">
+                      <a:extLst>
+                        <a:ext uri="{28A0092B-C50C-407E-A947-70E740481C1C}">
+                          <a14:useLocalDpi xmlns:a14="http://schemas.microsoft.com/office/drawing/2010/main" val="0"/>
+                        </a:ext>
+                      </a:extLst>
+                    </a:blip>
+                    <a:srcRect/>
+                    <a:stretch>
+                      <a:fillRect/>
+                    </a:stretch>
+                  </pic:blipFill>
+                  <pic:spPr bwMode="auto">
+                    <a:xfrm>
+                      <a:off x="0" y="0"/>
+                      <a:ext cx="2435860" cy="3248660"/>
+                    </a:xfrm>
+                    <a:prstGeom prst="rect">
+                      <a:avLst/>
+                    </a:prstGeom>
+                    <a:noFill/>
+                    <a:ln>
+                      <a:noFill/>
+                    </a:ln>
+                  </pic:spPr>
+                </pic:pic>
+              </a:graphicData>
+            </a:graphic>
+          </wp:anchor>
+        </w:drawing>
+      </w:r>
+    </w:p>
+    <w:p>
+      <w:pPr>
+        <w:rPr>
+          <w:rFonts w:hint="eastAsia"/>
           <w:highlight w:val="cyan"/>
+          <w:lang w:eastAsia="zh-CN"/>
+        </w:rPr>
+      </w:pPr>
+    </w:p>
+    <w:p>
+      <w:pPr>
+        <w:rPr>
+          <w:lang w:eastAsia="zh-CN"/>
+        </w:rPr>
+      </w:pPr>
+      <w:r>
+        <w:rPr>
+          <w:b/>
+          <w:bCs/>
+          <w:noProof/>
+          <w:lang w:eastAsia="zh-CN"/>
+        </w:rPr>
+        <w:drawing>
+          <wp:inline distT="0" distB="0" distL="0" distR="0" wp14:anchorId="3EB0667E" wp14:editId="12DB32FA">
+            <wp:extent cx="5726430" cy="3443605"/>
+            <wp:effectExtent l="0" t="0" r="7620" b="4445"/>
+            <wp:docPr id="1814408848" name="Picture 5"/>
+            <wp:cNvGraphicFramePr>
+              <a:graphicFrameLocks xmlns:a="http://schemas.openxmlformats.org/drawingml/2006/main" noChangeAspect="1"/>
+            </wp:cNvGraphicFramePr>
+            <a:graphic xmlns:a="http://schemas.openxmlformats.org/drawingml/2006/main">
+              <a:graphicData uri="http://schemas.openxmlformats.org/drawingml/2006/picture">
+                <pic:pic xmlns:pic="http://schemas.openxmlformats.org/drawingml/2006/picture">
+                  <pic:nvPicPr>
+                    <pic:cNvPr id="0" name="Picture 3"/>
+                    <pic:cNvPicPr>
+                      <a:picLocks noChangeAspect="1" noChangeArrowheads="1"/>
+                    </pic:cNvPicPr>
+                  </pic:nvPicPr>
+                  <pic:blipFill>
+                    <a:blip r:embed="rId10" cstate="print">
+                      <a:extLst>
+                        <a:ext uri="{28A0092B-C50C-407E-A947-70E740481C1C}">
+                          <a14:useLocalDpi xmlns:a14="http://schemas.microsoft.com/office/drawing/2010/main" val="0"/>
+                        </a:ext>
+                      </a:extLst>
+                    </a:blip>
+                    <a:srcRect/>
+                    <a:stretch>
+                      <a:fillRect/>
+                    </a:stretch>
+                  </pic:blipFill>
+                  <pic:spPr bwMode="auto">
+                    <a:xfrm>
+                      <a:off x="0" y="0"/>
+                      <a:ext cx="5726430" cy="3443605"/>
+                    </a:xfrm>
+                    <a:prstGeom prst="rect">
+                      <a:avLst/>
+                    </a:prstGeom>
+                    <a:noFill/>
+                    <a:ln>
+                      <a:noFill/>
+                    </a:ln>
+                  </pic:spPr>
+                </pic:pic>
+              </a:graphicData>
+            </a:graphic>
+          </wp:inline>
+        </w:drawing>
+      </w:r>
+    </w:p>
+    <w:p>
+      <w:pPr>
+        <w:rPr>
+          <w:highlight w:val="cyan"/>
+          <w:lang w:eastAsia="zh-CN"/>
+        </w:rPr>
+      </w:pPr>
+    </w:p>
+    <w:p>
+      <w:pPr>
+        <w:rPr>
+          <w:highlight w:val="cyan"/>
+          <w:lang w:eastAsia="zh-CN"/>
+        </w:rPr>
+      </w:pPr>
+    </w:p>
+    <w:p>
+      <w:pPr>
+        <w:rPr>
+          <w:highlight w:val="cyan"/>
+          <w:lang w:eastAsia="zh-CN"/>
+        </w:rPr>
+      </w:pPr>
+    </w:p>
+    <w:p>
+      <w:pPr>
+        <w:rPr>
+          <w:rFonts w:hint="eastAsia"/>
+          <w:highlight w:val="cyan"/>
+          <w:lang w:eastAsia="zh-CN"/>
         </w:rPr>
       </w:pPr>
     </w:p>
     <w:sectPr>
-      <w:headerReference w:type="default" r:id="rId8"/>
-      <w:footerReference w:type="default" r:id="rId9"/>
-      <w:headerReference w:type="first" r:id="rId10"/>
-      <w:footerReference w:type="first" r:id="rId11"/>
+      <w:headerReference w:type="even" r:id="rId11"/>
+      <w:headerReference w:type="default" r:id="rId12"/>
+      <w:footerReference w:type="even" r:id="rId13"/>
+      <w:footerReference w:type="default" r:id="rId14"/>
+      <w:headerReference w:type="first" r:id="rId15"/>
+      <w:footerReference w:type="first" r:id="rId16"/>
       <w:pgSz w:w="11906" w:h="16838"/>
       <w:pgMar w:top="1440" w:right="1440" w:bottom="1440" w:left="1440" w:header="850" w:footer="708" w:gutter="0"/>
       <w:cols w:space="708"/>
@@ -150,6 +442,16 @@
 </file>
 
 <file path=word/footer1.xml><?xml version="1.0" encoding="utf-8"?>
+<w:ftr xmlns:wpc="http://schemas.microsoft.com/office/word/2010/wordprocessingCanvas" xmlns:cx="http://schemas.microsoft.com/office/drawing/2014/chartex" xmlns:cx1="http://schemas.microsoft.com/office/drawing/2015/9/8/chartex" xmlns:cx2="http://schemas.microsoft.com/office/drawing/2015/10/21/chartex" xmlns:cx3="http://schemas.microsoft.com/office/drawing/2016/5/9/chartex" xmlns:cx4="http://schemas.microsoft.com/office/drawing/2016/5/10/chartex" xmlns:cx5="http://schemas.microsoft.com/office/drawing/2016/5/11/chartex" xmlns:cx6="http://schemas.microsoft.com/office/drawing/2016/5/12/chartex" xmlns:cx7="http://schemas.microsoft.com/office/drawing/2016/5/13/chartex" xmlns:cx8="http://schemas.microsoft.com/office/drawing/2016/5/14/chartex" xmlns:mc="http://schemas.openxmlformats.org/markup-compatibility/2006" xmlns:aink="http://schemas.microsoft.com/office/drawing/2016/ink" xmlns:am3d="http://schemas.microsoft.com/office/drawing/2017/model3d" xmlns:o="urn:schemas-microsoft-com:office:office" xmlns:oel="http://schemas.microsoft.com/office/2019/extlst" xmlns:r="http://schemas.openxmlformats.org/officeDocument/2006/relationships" xmlns:m="http://schemas.openxmlformats.org/officeDocument/2006/math" xmlns:v="urn:schemas-microsoft-com:vml" xmlns:wp14="http://schemas.microsoft.com/office/word/2010/wordprocessingDrawing" xmlns:wp="http://schemas.openxmlformats.org/drawingml/2006/wordprocessingDrawing" xmlns:w10="urn:schemas-microsoft-com:office:word" xmlns:w="http://schemas.openxmlformats.org/wordprocessingml/2006/main" xmlns:w14="http://schemas.microsoft.com/office/word/2010/wordml" xmlns:w15="http://schemas.microsoft.com/office/word/2012/wordml" xmlns:w16cex="http://schemas.microsoft.com/office/word/2018/wordml/cex" xmlns:w16cid="http://schemas.microsoft.com/office/word/2016/wordml/cid" xmlns:w16="http://schemas.microsoft.com/office/word/2018/wordml" xmlns:w16du="http://schemas.microsoft.com/office/word/2023/wordml/word16du" xmlns:w16sdtdh="http://schemas.microsoft.com/office/word/2020/wordml/sdtdatahash" xmlns:w16sdtfl="http://schemas.microsoft.com/office/word/2024/wordml/sdtformatlock" xmlns:w16se="http://schemas.microsoft.com/office/word/2015/wordml/symex" xmlns:wpg="http://schemas.microsoft.com/office/word/2010/wordprocessingGroup" xmlns:wpi="http://schemas.microsoft.com/office/word/2010/wordprocessingInk" xmlns:wne="http://schemas.microsoft.com/office/word/2006/wordml" xmlns:wps="http://schemas.microsoft.com/office/word/2010/wordprocessingShape" mc:Ignorable="w14 w15 w16se w16cid w16 w16cex w16sdtdh w16sdtfl w16du wp14">
+  <w:p>
+    <w:pPr>
+      <w:pStyle w:val="Footer"/>
+    </w:pPr>
+  </w:p>
+</w:ftr>
+</file>
+
+<file path=word/footer2.xml><?xml version="1.0" encoding="utf-8"?>
 <w:ftr xmlns:wpc="http://schemas.microsoft.com/office/word/2010/wordprocessingCanvas" xmlns:cx="http://schemas.microsoft.com/office/drawing/2014/chartex" xmlns:cx1="http://schemas.microsoft.com/office/drawing/2015/9/8/chartex" xmlns:cx2="http://schemas.microsoft.com/office/drawing/2015/10/21/chartex" xmlns:cx3="http://schemas.microsoft.com/office/drawing/2016/5/9/chartex" xmlns:cx4="http://schemas.microsoft.com/office/drawing/2016/5/10/chartex" xmlns:cx5="http://schemas.microsoft.com/office/drawing/2016/5/11/chartex" xmlns:cx6="http://schemas.microsoft.com/office/drawing/2016/5/12/chartex" xmlns:cx7="http://schemas.microsoft.com/office/drawing/2016/5/13/chartex" xmlns:cx8="http://schemas.microsoft.com/office/drawing/2016/5/14/chartex" xmlns:mc="http://schemas.openxmlformats.org/markup-compatibility/2006" xmlns:aink="http://schemas.microsoft.com/office/drawing/2016/ink" xmlns:am3d="http://schemas.microsoft.com/office/drawing/2017/model3d" xmlns:o="urn:schemas-microsoft-com:office:office" xmlns:oel="http://schemas.microsoft.com/office/2019/extlst" xmlns:r="http://schemas.openxmlformats.org/officeDocument/2006/relationships" xmlns:m="http://schemas.openxmlformats.org/officeDocument/2006/math" xmlns:v="urn:schemas-microsoft-com:vml" xmlns:wp14="http://schemas.microsoft.com/office/word/2010/wordprocessingDrawing" xmlns:wp="http://schemas.openxmlformats.org/drawingml/2006/wordprocessingDrawing" xmlns:w10="urn:schemas-microsoft-com:office:word" xmlns:w="http://schemas.openxmlformats.org/wordprocessingml/2006/main" xmlns:w14="http://schemas.microsoft.com/office/word/2010/wordml" xmlns:w15="http://schemas.microsoft.com/office/word/2012/wordml" xmlns:w16cex="http://schemas.microsoft.com/office/word/2018/wordml/cex" xmlns:w16cid="http://schemas.microsoft.com/office/word/2016/wordml/cid" xmlns:w16="http://schemas.microsoft.com/office/word/2018/wordml" xmlns:w16du="http://schemas.microsoft.com/office/word/2023/wordml/word16du" xmlns:w16sdtdh="http://schemas.microsoft.com/office/word/2020/wordml/sdtdatahash" xmlns:w16sdtfl="http://schemas.microsoft.com/office/word/2024/wordml/sdtformatlock" xmlns:w16se="http://schemas.microsoft.com/office/word/2015/wordml/symex" xmlns:wpg="http://schemas.microsoft.com/office/word/2010/wordprocessingGroup" xmlns:wpi="http://schemas.microsoft.com/office/word/2010/wordprocessingInk" xmlns:wne="http://schemas.microsoft.com/office/word/2006/wordml" xmlns:wps="http://schemas.microsoft.com/office/word/2010/wordprocessingShape" mc:Ignorable="w14 w15 w16se w16cid w16 w16cex w16sdtdh w16sdtfl w16du wp14">
   <w:sdt>
     <w:sdtPr>
@@ -226,7 +528,7 @@
             </mc:Choice>
             <mc:Fallback>
               <w:pict>
-                <v:line w14:anchorId="68CAF598" id="Straight Connector 4" o:spid="_x0000_s1026" style="position:absolute;z-index:251658243;visibility:visible;mso-wrap-style:square;mso-wrap-distance-left:9pt;mso-wrap-distance-top:0;mso-wrap-distance-right:9pt;mso-wrap-distance-bottom:0;mso-position-horizontal:absolute;mso-position-horizontal-relative:text;mso-position-vertical:absolute;mso-position-vertical-relative:text" from="-.75pt,-10.2pt" to="454.5pt,-10.2pt" o:gfxdata="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" strokecolor="#4472c4 [3204]" strokeweight=".5pt">
+                <v:line w14:anchorId="058EFBE3" id="Straight Connector 4" o:spid="_x0000_s1026" style="position:absolute;z-index:251658243;visibility:visible;mso-wrap-style:square;mso-wrap-distance-left:9pt;mso-wrap-distance-top:0;mso-wrap-distance-right:9pt;mso-wrap-distance-bottom:0;mso-position-horizontal:absolute;mso-position-horizontal-relative:text;mso-position-vertical:absolute;mso-position-vertical-relative:text" from="-.75pt,-10.2pt" to="454.5pt,-10.2pt" o:gfxdata="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" strokecolor="#4472c4 [3204]" strokeweight=".5pt">
                   <v:stroke joinstyle="miter"/>
                 </v:line>
               </w:pict>
@@ -265,27 +567,19 @@
         <w:iCs/>
         <w:sz w:val="18"/>
         <w:szCs w:val="18"/>
+        <w:lang w:eastAsia="zh-CN"/>
       </w:rPr>
     </w:pPr>
     <w:r>
       <w:rPr>
+        <w:rFonts w:hint="eastAsia"/>
         <w:i/>
         <w:iCs/>
         <w:sz w:val="18"/>
         <w:szCs w:val="18"/>
-        <w:highlight w:val="yellow"/>
-      </w:rPr>
-      <w:t>Your name</w:t>
-    </w:r>
-    <w:r>
-      <w:rPr>
-        <w:i/>
-        <w:iCs/>
-        <w:sz w:val="18"/>
-        <w:szCs w:val="18"/>
-        <w:highlight w:val="yellow"/>
-      </w:rPr>
-      <w:t>, student ID</w:t>
+        <w:lang w:eastAsia="zh-CN"/>
+      </w:rPr>
+      <w:t>Mingchen Sun, 20718523</w:t>
     </w:r>
     <w:r>
       <w:rPr>
@@ -300,7 +594,7 @@
 </w:ftr>
 </file>
 
-<file path=word/footer2.xml><?xml version="1.0" encoding="utf-8"?>
+<file path=word/footer3.xml><?xml version="1.0" encoding="utf-8"?>
 <w:ftr xmlns:wpc="http://schemas.microsoft.com/office/word/2010/wordprocessingCanvas" xmlns:cx="http://schemas.microsoft.com/office/drawing/2014/chartex" xmlns:cx1="http://schemas.microsoft.com/office/drawing/2015/9/8/chartex" xmlns:cx2="http://schemas.microsoft.com/office/drawing/2015/10/21/chartex" xmlns:cx3="http://schemas.microsoft.com/office/drawing/2016/5/9/chartex" xmlns:cx4="http://schemas.microsoft.com/office/drawing/2016/5/10/chartex" xmlns:cx5="http://schemas.microsoft.com/office/drawing/2016/5/11/chartex" xmlns:cx6="http://schemas.microsoft.com/office/drawing/2016/5/12/chartex" xmlns:cx7="http://schemas.microsoft.com/office/drawing/2016/5/13/chartex" xmlns:cx8="http://schemas.microsoft.com/office/drawing/2016/5/14/chartex" xmlns:mc="http://schemas.openxmlformats.org/markup-compatibility/2006" xmlns:aink="http://schemas.microsoft.com/office/drawing/2016/ink" xmlns:am3d="http://schemas.microsoft.com/office/drawing/2017/model3d" xmlns:o="urn:schemas-microsoft-com:office:office" xmlns:oel="http://schemas.microsoft.com/office/2019/extlst" xmlns:r="http://schemas.openxmlformats.org/officeDocument/2006/relationships" xmlns:m="http://schemas.openxmlformats.org/officeDocument/2006/math" xmlns:v="urn:schemas-microsoft-com:vml" xmlns:wp14="http://schemas.microsoft.com/office/word/2010/wordprocessingDrawing" xmlns:wp="http://schemas.openxmlformats.org/drawingml/2006/wordprocessingDrawing" xmlns:w10="urn:schemas-microsoft-com:office:word" xmlns:w="http://schemas.openxmlformats.org/wordprocessingml/2006/main" xmlns:w14="http://schemas.microsoft.com/office/word/2010/wordml" xmlns:w15="http://schemas.microsoft.com/office/word/2012/wordml" xmlns:w16cex="http://schemas.microsoft.com/office/word/2018/wordml/cex" xmlns:w16cid="http://schemas.microsoft.com/office/word/2016/wordml/cid" xmlns:w16="http://schemas.microsoft.com/office/word/2018/wordml" xmlns:w16du="http://schemas.microsoft.com/office/word/2023/wordml/word16du" xmlns:w16sdtdh="http://schemas.microsoft.com/office/word/2020/wordml/sdtdatahash" xmlns:w16sdtfl="http://schemas.microsoft.com/office/word/2024/wordml/sdtformatlock" xmlns:w16se="http://schemas.microsoft.com/office/word/2015/wordml/symex" xmlns:wpg="http://schemas.microsoft.com/office/word/2010/wordprocessingGroup" xmlns:wpi="http://schemas.microsoft.com/office/word/2010/wordprocessingInk" xmlns:wne="http://schemas.microsoft.com/office/word/2006/wordml" xmlns:wps="http://schemas.microsoft.com/office/word/2010/wordprocessingShape" mc:Ignorable="w14 w15 w16se w16cid w16 w16cex w16sdtdh w16sdtfl w16du wp14">
   <w:p>
     <w:pPr>
@@ -347,6 +641,16 @@
   <w:p>
     <w:pPr>
       <w:pStyle w:val="Header"/>
+    </w:pPr>
+  </w:p>
+</w:hdr>
+</file>
+
+<file path=word/header2.xml><?xml version="1.0" encoding="utf-8"?>
+<w:hdr xmlns:wpc="http://schemas.microsoft.com/office/word/2010/wordprocessingCanvas" xmlns:cx="http://schemas.microsoft.com/office/drawing/2014/chartex" xmlns:cx1="http://schemas.microsoft.com/office/drawing/2015/9/8/chartex" xmlns:cx2="http://schemas.microsoft.com/office/drawing/2015/10/21/chartex" xmlns:cx3="http://schemas.microsoft.com/office/drawing/2016/5/9/chartex" xmlns:cx4="http://schemas.microsoft.com/office/drawing/2016/5/10/chartex" xmlns:cx5="http://schemas.microsoft.com/office/drawing/2016/5/11/chartex" xmlns:cx6="http://schemas.microsoft.com/office/drawing/2016/5/12/chartex" xmlns:cx7="http://schemas.microsoft.com/office/drawing/2016/5/13/chartex" xmlns:cx8="http://schemas.microsoft.com/office/drawing/2016/5/14/chartex" xmlns:mc="http://schemas.openxmlformats.org/markup-compatibility/2006" xmlns:aink="http://schemas.microsoft.com/office/drawing/2016/ink" xmlns:am3d="http://schemas.microsoft.com/office/drawing/2017/model3d" xmlns:o="urn:schemas-microsoft-com:office:office" xmlns:oel="http://schemas.microsoft.com/office/2019/extlst" xmlns:r="http://schemas.openxmlformats.org/officeDocument/2006/relationships" xmlns:m="http://schemas.openxmlformats.org/officeDocument/2006/math" xmlns:v="urn:schemas-microsoft-com:vml" xmlns:wp14="http://schemas.microsoft.com/office/word/2010/wordprocessingDrawing" xmlns:wp="http://schemas.openxmlformats.org/drawingml/2006/wordprocessingDrawing" xmlns:w10="urn:schemas-microsoft-com:office:word" xmlns:w="http://schemas.openxmlformats.org/wordprocessingml/2006/main" xmlns:w14="http://schemas.microsoft.com/office/word/2010/wordml" xmlns:w15="http://schemas.microsoft.com/office/word/2012/wordml" xmlns:w16cex="http://schemas.microsoft.com/office/word/2018/wordml/cex" xmlns:w16cid="http://schemas.microsoft.com/office/word/2016/wordml/cid" xmlns:w16="http://schemas.microsoft.com/office/word/2018/wordml" xmlns:w16du="http://schemas.microsoft.com/office/word/2023/wordml/word16du" xmlns:w16sdtdh="http://schemas.microsoft.com/office/word/2020/wordml/sdtdatahash" xmlns:w16sdtfl="http://schemas.microsoft.com/office/word/2024/wordml/sdtformatlock" xmlns:w16se="http://schemas.microsoft.com/office/word/2015/wordml/symex" xmlns:wpg="http://schemas.microsoft.com/office/word/2010/wordprocessingGroup" xmlns:wpi="http://schemas.microsoft.com/office/word/2010/wordprocessingInk" xmlns:wne="http://schemas.microsoft.com/office/word/2006/wordml" xmlns:wps="http://schemas.microsoft.com/office/word/2010/wordprocessingShape" mc:Ignorable="w14 w15 w16se w16cid w16 w16cex w16sdtdh w16sdtfl w16du wp14">
+  <w:p>
+    <w:pPr>
+      <w:pStyle w:val="Header"/>
       <w:rPr>
         <w:i/>
         <w:iCs/>
@@ -369,7 +673,7 @@
 </w:hdr>
 </file>
 
-<file path=word/header2.xml><?xml version="1.0" encoding="utf-8"?>
+<file path=word/header3.xml><?xml version="1.0" encoding="utf-8"?>
 <w:hdr xmlns:wpc="http://schemas.microsoft.com/office/word/2010/wordprocessingCanvas" xmlns:cx="http://schemas.microsoft.com/office/drawing/2014/chartex" xmlns:cx1="http://schemas.microsoft.com/office/drawing/2015/9/8/chartex" xmlns:cx2="http://schemas.microsoft.com/office/drawing/2015/10/21/chartex" xmlns:cx3="http://schemas.microsoft.com/office/drawing/2016/5/9/chartex" xmlns:cx4="http://schemas.microsoft.com/office/drawing/2016/5/10/chartex" xmlns:cx5="http://schemas.microsoft.com/office/drawing/2016/5/11/chartex" xmlns:cx6="http://schemas.microsoft.com/office/drawing/2016/5/12/chartex" xmlns:cx7="http://schemas.microsoft.com/office/drawing/2016/5/13/chartex" xmlns:cx8="http://schemas.microsoft.com/office/drawing/2016/5/14/chartex" xmlns:mc="http://schemas.openxmlformats.org/markup-compatibility/2006" xmlns:aink="http://schemas.microsoft.com/office/drawing/2016/ink" xmlns:am3d="http://schemas.microsoft.com/office/drawing/2017/model3d" xmlns:o="urn:schemas-microsoft-com:office:office" xmlns:oel="http://schemas.microsoft.com/office/2019/extlst" xmlns:r="http://schemas.openxmlformats.org/officeDocument/2006/relationships" xmlns:m="http://schemas.openxmlformats.org/officeDocument/2006/math" xmlns:v="urn:schemas-microsoft-com:vml" xmlns:wp14="http://schemas.microsoft.com/office/word/2010/wordprocessingDrawing" xmlns:wp="http://schemas.openxmlformats.org/drawingml/2006/wordprocessingDrawing" xmlns:w10="urn:schemas-microsoft-com:office:word" xmlns:w="http://schemas.openxmlformats.org/wordprocessingml/2006/main" xmlns:w14="http://schemas.microsoft.com/office/word/2010/wordml" xmlns:w15="http://schemas.microsoft.com/office/word/2012/wordml" xmlns:w16cex="http://schemas.microsoft.com/office/word/2018/wordml/cex" xmlns:w16cid="http://schemas.microsoft.com/office/word/2016/wordml/cid" xmlns:w16="http://schemas.microsoft.com/office/word/2018/wordml" xmlns:w16du="http://schemas.microsoft.com/office/word/2023/wordml/word16du" xmlns:w16sdtdh="http://schemas.microsoft.com/office/word/2020/wordml/sdtdatahash" xmlns:w16sdtfl="http://schemas.microsoft.com/office/word/2024/wordml/sdtformatlock" xmlns:w16se="http://schemas.microsoft.com/office/word/2015/wordml/symex" xmlns:wpg="http://schemas.microsoft.com/office/word/2010/wordprocessingGroup" xmlns:wpi="http://schemas.microsoft.com/office/word/2010/wordprocessingInk" xmlns:wne="http://schemas.microsoft.com/office/word/2006/wordml" xmlns:wps="http://schemas.microsoft.com/office/word/2010/wordprocessingShape" mc:Ignorable="w14 w15 w16se w16cid w16 w16cex w16sdtdh w16sdtfl w16du wp14">
   <w:p>
     <w:pPr>
@@ -975,7 +1279,7 @@
   <w:docDefaults>
     <w:rPrDefault>
       <w:rPr>
-        <w:rFonts w:asciiTheme="minorHAnsi" w:eastAsiaTheme="minorHAnsi" w:hAnsiTheme="minorHAnsi" w:cstheme="minorBidi"/>
+        <w:rFonts w:asciiTheme="minorHAnsi" w:eastAsia="宋体" w:hAnsiTheme="minorHAnsi" w:cstheme="minorBidi"/>
         <w:sz w:val="22"/>
         <w:szCs w:val="22"/>
         <w:lang w:val="en-GB" w:eastAsia="en-US" w:bidi="ar-SA"/>

</xml_diff>

<commit_message>
Prepare final submission files
</commit_message>
<xml_diff>
--- a/MATLAB Coursework 2  Word Template.docx
+++ b/MATLAB Coursework 2  Word Template.docx
@@ -21,18 +21,42 @@
     <w:p>
       <w:pPr>
         <w:rPr>
+          <w:b/>
+          <w:bCs/>
+          <w:lang w:eastAsia="zh-CN"/>
+        </w:rPr>
+      </w:pPr>
+      <w:r>
+        <w:rPr>
+          <w:b/>
+          <w:bCs/>
+        </w:rPr>
+        <w:t xml:space="preserve">Author: </w:t>
+      </w:r>
+      <w:r>
+        <w:rPr>
           <w:rFonts w:hint="eastAsia"/>
           <w:b/>
           <w:bCs/>
           <w:lang w:eastAsia="zh-CN"/>
         </w:rPr>
-      </w:pPr>
-      <w:r>
+        <w:t>Mingchen Sun</w:t>
+      </w:r>
+    </w:p>
+    <w:p>
+      <w:pPr>
         <w:rPr>
           <w:b/>
           <w:bCs/>
-        </w:rPr>
-        <w:t xml:space="preserve">Author: </w:t>
+          <w:lang w:eastAsia="zh-CN"/>
+        </w:rPr>
+      </w:pPr>
+      <w:r>
+        <w:rPr>
+          <w:b/>
+          <w:bCs/>
+        </w:rPr>
+        <w:t>Student ID:</w:t>
       </w:r>
       <w:r>
         <w:rPr>
@@ -41,39 +65,12 @@
           <w:bCs/>
           <w:lang w:eastAsia="zh-CN"/>
         </w:rPr>
-        <w:t>Mingchen Sun</w:t>
-      </w:r>
-    </w:p>
-    <w:p>
-      <w:pPr>
-        <w:rPr>
-          <w:rFonts w:hint="eastAsia"/>
-          <w:b/>
-          <w:bCs/>
-          <w:lang w:eastAsia="zh-CN"/>
-        </w:rPr>
-      </w:pPr>
-      <w:r>
-        <w:rPr>
-          <w:b/>
-          <w:bCs/>
-        </w:rPr>
-        <w:t>Student ID:</w:t>
-      </w:r>
-      <w:r>
-        <w:rPr>
-          <w:rFonts w:hint="eastAsia"/>
-          <w:b/>
-          <w:bCs/>
-          <w:lang w:eastAsia="zh-CN"/>
-        </w:rPr>
         <w:t xml:space="preserve"> 20718523</w:t>
       </w:r>
     </w:p>
     <w:p>
       <w:pPr>
         <w:rPr>
-          <w:rFonts w:hint="eastAsia"/>
           <w:b/>
           <w:bCs/>
           <w:lang w:eastAsia="zh-CN"/>
@@ -136,7 +133,6 @@
     <w:p>
       <w:pPr>
         <w:rPr>
-          <w:rFonts w:hint="eastAsia"/>
           <w:b/>
           <w:bCs/>
           <w:lang w:eastAsia="zh-CN"/>
@@ -296,7 +292,6 @@
     <w:p>
       <w:pPr>
         <w:rPr>
-          <w:rFonts w:hint="eastAsia"/>
           <w:highlight w:val="cyan"/>
           <w:lang w:eastAsia="zh-CN"/>
         </w:rPr>
@@ -316,7 +311,7 @@
           <w:lang w:eastAsia="zh-CN"/>
         </w:rPr>
         <w:drawing>
-          <wp:inline distT="0" distB="0" distL="0" distR="0" wp14:anchorId="3EB0667E" wp14:editId="12DB32FA">
+          <wp:inline distT="0" distB="0" distL="0" distR="0" wp14:anchorId="3EB0667E" wp14:editId="50056FF8">
             <wp:extent cx="5726430" cy="3443605"/>
             <wp:effectExtent l="0" t="0" r="7620" b="4445"/>
             <wp:docPr id="1814408848" name="Picture 5"/>
@@ -392,19 +387,653 @@
     <w:p>
       <w:pPr>
         <w:rPr>
+          <w:b/>
+          <w:bCs/>
+          <w:lang w:eastAsia="zh-CN"/>
+        </w:rPr>
+      </w:pPr>
+      <w:r>
+        <w:rPr>
+          <w:rFonts w:hint="eastAsia"/>
+          <w:b/>
+          <w:bCs/>
+          <w:lang w:eastAsia="zh-CN"/>
+        </w:rPr>
+        <w:lastRenderedPageBreak/>
+        <w:t>Task 2:</w:t>
+      </w:r>
+    </w:p>
+    <w:p>
+      <w:pPr>
+        <w:rPr>
+          <w:highlight w:val="cyan"/>
+          <w:lang w:eastAsia="zh-CN"/>
+        </w:rPr>
+      </w:pPr>
+      <w:r>
+        <w:rPr>
+          <w:noProof/>
+          <w:lang w:eastAsia="zh-CN"/>
+        </w:rPr>
+        <w:drawing>
+          <wp:inline distT="0" distB="0" distL="0" distR="0" wp14:anchorId="3CA1EECF" wp14:editId="18A6BF4B">
+            <wp:extent cx="4169309" cy="5559695"/>
+            <wp:effectExtent l="0" t="9525" r="0" b="0"/>
+            <wp:docPr id="322269886" name="Picture 3"/>
+            <wp:cNvGraphicFramePr>
+              <a:graphicFrameLocks xmlns:a="http://schemas.openxmlformats.org/drawingml/2006/main" noChangeAspect="1"/>
+            </wp:cNvGraphicFramePr>
+            <a:graphic xmlns:a="http://schemas.openxmlformats.org/drawingml/2006/main">
+              <a:graphicData uri="http://schemas.openxmlformats.org/drawingml/2006/picture">
+                <pic:pic xmlns:pic="http://schemas.openxmlformats.org/drawingml/2006/picture">
+                  <pic:nvPicPr>
+                    <pic:cNvPr id="0" name="Picture 1"/>
+                    <pic:cNvPicPr>
+                      <a:picLocks noChangeAspect="1" noChangeArrowheads="1"/>
+                    </pic:cNvPicPr>
+                  </pic:nvPicPr>
+                  <pic:blipFill>
+                    <a:blip r:embed="rId11" cstate="print">
+                      <a:extLst>
+                        <a:ext uri="{28A0092B-C50C-407E-A947-70E740481C1C}">
+                          <a14:useLocalDpi xmlns:a14="http://schemas.microsoft.com/office/drawing/2010/main" val="0"/>
+                        </a:ext>
+                      </a:extLst>
+                    </a:blip>
+                    <a:srcRect/>
+                    <a:stretch>
+                      <a:fillRect/>
+                    </a:stretch>
+                  </pic:blipFill>
+                  <pic:spPr bwMode="auto">
+                    <a:xfrm rot="16200000">
+                      <a:off x="0" y="0"/>
+                      <a:ext cx="4179216" cy="5572906"/>
+                    </a:xfrm>
+                    <a:prstGeom prst="rect">
+                      <a:avLst/>
+                    </a:prstGeom>
+                    <a:noFill/>
+                    <a:ln>
+                      <a:noFill/>
+                    </a:ln>
+                  </pic:spPr>
+                </pic:pic>
+              </a:graphicData>
+            </a:graphic>
+          </wp:inline>
+        </w:drawing>
+      </w:r>
+    </w:p>
+    <w:p>
+      <w:pPr>
+        <w:rPr>
+          <w:highlight w:val="cyan"/>
+          <w:lang w:val="en-US" w:eastAsia="zh-CN"/>
+        </w:rPr>
+      </w:pPr>
+      <w:r>
+        <w:rPr>
+          <w:noProof/>
+          <w:highlight w:val="cyan"/>
+          <w:lang w:val="en-US" w:eastAsia="zh-CN"/>
+        </w:rPr>
+        <w:drawing>
+          <wp:inline distT="0" distB="0" distL="0" distR="0" wp14:anchorId="1BE9CF88" wp14:editId="5B2F9D78">
+            <wp:extent cx="5731510" cy="3755390"/>
+            <wp:effectExtent l="0" t="0" r="2540" b="0"/>
+            <wp:docPr id="164981740" name="Picture 6"/>
+            <wp:cNvGraphicFramePr>
+              <a:graphicFrameLocks xmlns:a="http://schemas.openxmlformats.org/drawingml/2006/main" noChangeAspect="1"/>
+            </wp:cNvGraphicFramePr>
+            <a:graphic xmlns:a="http://schemas.openxmlformats.org/drawingml/2006/main">
+              <a:graphicData uri="http://schemas.openxmlformats.org/drawingml/2006/picture">
+                <pic:pic xmlns:pic="http://schemas.openxmlformats.org/drawingml/2006/picture">
+                  <pic:nvPicPr>
+                    <pic:cNvPr id="0" name="Picture 8"/>
+                    <pic:cNvPicPr>
+                      <a:picLocks noChangeAspect="1" noChangeArrowheads="1"/>
+                    </pic:cNvPicPr>
+                  </pic:nvPicPr>
+                  <pic:blipFill>
+                    <a:blip r:embed="rId12">
+                      <a:extLst>
+                        <a:ext uri="{28A0092B-C50C-407E-A947-70E740481C1C}">
+                          <a14:useLocalDpi xmlns:a14="http://schemas.microsoft.com/office/drawing/2010/main" val="0"/>
+                        </a:ext>
+                      </a:extLst>
+                    </a:blip>
+                    <a:srcRect/>
+                    <a:stretch>
+                      <a:fillRect/>
+                    </a:stretch>
+                  </pic:blipFill>
+                  <pic:spPr bwMode="auto">
+                    <a:xfrm>
+                      <a:off x="0" y="0"/>
+                      <a:ext cx="5731510" cy="3755390"/>
+                    </a:xfrm>
+                    <a:prstGeom prst="rect">
+                      <a:avLst/>
+                    </a:prstGeom>
+                    <a:noFill/>
+                    <a:ln>
+                      <a:noFill/>
+                    </a:ln>
+                  </pic:spPr>
+                </pic:pic>
+              </a:graphicData>
+            </a:graphic>
+          </wp:inline>
+        </w:drawing>
+      </w:r>
+    </w:p>
+    <w:p>
+      <w:pPr>
+        <w:rPr>
+          <w:highlight w:val="cyan"/>
+          <w:lang w:val="en-US" w:eastAsia="zh-CN"/>
+        </w:rPr>
+      </w:pPr>
+      <w:r>
+        <w:rPr>
+          <w:noProof/>
+          <w:highlight w:val="cyan"/>
+          <w:lang w:val="en-US" w:eastAsia="zh-CN"/>
+        </w:rPr>
+        <w:lastRenderedPageBreak/>
+        <w:drawing>
+          <wp:inline distT="0" distB="0" distL="0" distR="0" wp14:anchorId="39544566" wp14:editId="36298A03">
+            <wp:extent cx="5525135" cy="8858885"/>
+            <wp:effectExtent l="0" t="0" r="0" b="0"/>
+            <wp:docPr id="1559288973" name="Picture 7"/>
+            <wp:cNvGraphicFramePr>
+              <a:graphicFrameLocks xmlns:a="http://schemas.openxmlformats.org/drawingml/2006/main" noChangeAspect="1"/>
+            </wp:cNvGraphicFramePr>
+            <a:graphic xmlns:a="http://schemas.openxmlformats.org/drawingml/2006/main">
+              <a:graphicData uri="http://schemas.openxmlformats.org/drawingml/2006/picture">
+                <pic:pic xmlns:pic="http://schemas.openxmlformats.org/drawingml/2006/picture">
+                  <pic:nvPicPr>
+                    <pic:cNvPr id="0" name="Picture 10"/>
+                    <pic:cNvPicPr>
+                      <a:picLocks noChangeAspect="1" noChangeArrowheads="1"/>
+                    </pic:cNvPicPr>
+                  </pic:nvPicPr>
+                  <pic:blipFill>
+                    <a:blip r:embed="rId13" cstate="print">
+                      <a:extLst>
+                        <a:ext uri="{28A0092B-C50C-407E-A947-70E740481C1C}">
+                          <a14:useLocalDpi xmlns:a14="http://schemas.microsoft.com/office/drawing/2010/main" val="0"/>
+                        </a:ext>
+                      </a:extLst>
+                    </a:blip>
+                    <a:srcRect/>
+                    <a:stretch>
+                      <a:fillRect/>
+                    </a:stretch>
+                  </pic:blipFill>
+                  <pic:spPr bwMode="auto">
+                    <a:xfrm>
+                      <a:off x="0" y="0"/>
+                      <a:ext cx="5525135" cy="8858885"/>
+                    </a:xfrm>
+                    <a:prstGeom prst="rect">
+                      <a:avLst/>
+                    </a:prstGeom>
+                    <a:noFill/>
+                    <a:ln>
+                      <a:noFill/>
+                    </a:ln>
+                  </pic:spPr>
+                </pic:pic>
+              </a:graphicData>
+            </a:graphic>
+          </wp:inline>
+        </w:drawing>
+      </w:r>
+    </w:p>
+    <w:p>
+      <w:pPr>
+        <w:rPr>
+          <w:highlight w:val="cyan"/>
+          <w:lang w:val="en-US" w:eastAsia="zh-CN"/>
+        </w:rPr>
+      </w:pPr>
+      <w:r>
+        <w:rPr>
+          <w:noProof/>
+          <w:highlight w:val="cyan"/>
+          <w:lang w:val="en-US" w:eastAsia="zh-CN"/>
+        </w:rPr>
+        <w:lastRenderedPageBreak/>
+        <w:drawing>
+          <wp:inline distT="0" distB="0" distL="0" distR="0" wp14:anchorId="4D31624A" wp14:editId="13797927">
+            <wp:extent cx="5311140" cy="8858885"/>
+            <wp:effectExtent l="0" t="0" r="3810" b="0"/>
+            <wp:docPr id="1218485502" name="Picture 8"/>
+            <wp:cNvGraphicFramePr>
+              <a:graphicFrameLocks xmlns:a="http://schemas.openxmlformats.org/drawingml/2006/main" noChangeAspect="1"/>
+            </wp:cNvGraphicFramePr>
+            <a:graphic xmlns:a="http://schemas.openxmlformats.org/drawingml/2006/main">
+              <a:graphicData uri="http://schemas.openxmlformats.org/drawingml/2006/picture">
+                <pic:pic xmlns:pic="http://schemas.openxmlformats.org/drawingml/2006/picture">
+                  <pic:nvPicPr>
+                    <pic:cNvPr id="0" name="Picture 11"/>
+                    <pic:cNvPicPr>
+                      <a:picLocks noChangeAspect="1" noChangeArrowheads="1"/>
+                    </pic:cNvPicPr>
+                  </pic:nvPicPr>
+                  <pic:blipFill>
+                    <a:blip r:embed="rId14" cstate="print">
+                      <a:extLst>
+                        <a:ext uri="{28A0092B-C50C-407E-A947-70E740481C1C}">
+                          <a14:useLocalDpi xmlns:a14="http://schemas.microsoft.com/office/drawing/2010/main" val="0"/>
+                        </a:ext>
+                      </a:extLst>
+                    </a:blip>
+                    <a:srcRect/>
+                    <a:stretch>
+                      <a:fillRect/>
+                    </a:stretch>
+                  </pic:blipFill>
+                  <pic:spPr bwMode="auto">
+                    <a:xfrm>
+                      <a:off x="0" y="0"/>
+                      <a:ext cx="5311140" cy="8858885"/>
+                    </a:xfrm>
+                    <a:prstGeom prst="rect">
+                      <a:avLst/>
+                    </a:prstGeom>
+                    <a:noFill/>
+                    <a:ln>
+                      <a:noFill/>
+                    </a:ln>
+                  </pic:spPr>
+                </pic:pic>
+              </a:graphicData>
+            </a:graphic>
+          </wp:inline>
+        </w:drawing>
+      </w:r>
+    </w:p>
+    <w:p>
+      <w:pPr>
+        <w:rPr>
+          <w:b/>
+          <w:bCs/>
+          <w:lang w:eastAsia="zh-CN"/>
+        </w:rPr>
+      </w:pPr>
+      <w:r>
+        <w:rPr>
+          <w:rFonts w:hint="eastAsia"/>
+          <w:b/>
+          <w:bCs/>
+          <w:lang w:eastAsia="zh-CN"/>
+        </w:rPr>
+        <w:lastRenderedPageBreak/>
+        <w:t xml:space="preserve">Task </w:t>
+      </w:r>
+      <w:r>
+        <w:rPr>
+          <w:rFonts w:hint="eastAsia"/>
+          <w:b/>
+          <w:bCs/>
+          <w:lang w:eastAsia="zh-CN"/>
+        </w:rPr>
+        <w:t>3</w:t>
+      </w:r>
+      <w:r>
+        <w:rPr>
+          <w:rFonts w:hint="eastAsia"/>
+          <w:b/>
+          <w:bCs/>
+          <w:lang w:eastAsia="zh-CN"/>
+        </w:rPr>
+        <w:t>:</w:t>
+      </w:r>
+    </w:p>
+    <w:p>
+      <w:pPr>
+        <w:rPr>
+          <w:b/>
+          <w:bCs/>
+          <w:lang w:eastAsia="zh-CN"/>
+        </w:rPr>
+      </w:pPr>
+      <w:r>
+        <w:rPr>
+          <w:noProof/>
+          <w:lang w:eastAsia="zh-CN"/>
+        </w:rPr>
+        <w:drawing>
+          <wp:inline distT="0" distB="0" distL="0" distR="0" wp14:anchorId="6A3A78EF" wp14:editId="440F43BF">
+            <wp:extent cx="5113114" cy="8519619"/>
+            <wp:effectExtent l="0" t="0" r="0" b="0"/>
+            <wp:docPr id="1566391809" name="Picture 3"/>
+            <wp:cNvGraphicFramePr>
+              <a:graphicFrameLocks xmlns:a="http://schemas.openxmlformats.org/drawingml/2006/main" noChangeAspect="1"/>
+            </wp:cNvGraphicFramePr>
+            <a:graphic xmlns:a="http://schemas.openxmlformats.org/drawingml/2006/main">
+              <a:graphicData uri="http://schemas.openxmlformats.org/drawingml/2006/picture">
+                <pic:pic xmlns:pic="http://schemas.openxmlformats.org/drawingml/2006/picture">
+                  <pic:nvPicPr>
+                    <pic:cNvPr id="0" name="Picture 1"/>
+                    <pic:cNvPicPr>
+                      <a:picLocks noChangeAspect="1" noChangeArrowheads="1"/>
+                    </pic:cNvPicPr>
+                  </pic:nvPicPr>
+                  <pic:blipFill>
+                    <a:blip r:embed="rId15" cstate="print">
+                      <a:extLst>
+                        <a:ext uri="{28A0092B-C50C-407E-A947-70E740481C1C}">
+                          <a14:useLocalDpi xmlns:a14="http://schemas.microsoft.com/office/drawing/2010/main" val="0"/>
+                        </a:ext>
+                      </a:extLst>
+                    </a:blip>
+                    <a:srcRect/>
+                    <a:stretch>
+                      <a:fillRect/>
+                    </a:stretch>
+                  </pic:blipFill>
+                  <pic:spPr bwMode="auto">
+                    <a:xfrm>
+                      <a:off x="0" y="0"/>
+                      <a:ext cx="5114125" cy="8521304"/>
+                    </a:xfrm>
+                    <a:prstGeom prst="rect">
+                      <a:avLst/>
+                    </a:prstGeom>
+                    <a:noFill/>
+                    <a:ln>
+                      <a:noFill/>
+                    </a:ln>
+                  </pic:spPr>
+                </pic:pic>
+              </a:graphicData>
+            </a:graphic>
+          </wp:inline>
+        </w:drawing>
+      </w:r>
+    </w:p>
+    <w:p>
+      <w:pPr>
+        <w:rPr>
+          <w:b/>
+          <w:bCs/>
+          <w:lang w:eastAsia="zh-CN"/>
+        </w:rPr>
+      </w:pPr>
+      <w:r>
+        <w:rPr>
+          <w:b/>
+          <w:bCs/>
+          <w:lang w:eastAsia="zh-CN"/>
+        </w:rPr>
+        <w:lastRenderedPageBreak/>
+        <w:t>Task 3 Improvement: Using Two Temperature Sensors</w:t>
+      </w:r>
+      <w:r>
+        <w:rPr>
+          <w:rFonts w:hint="eastAsia"/>
+          <w:b/>
+          <w:bCs/>
+          <w:lang w:eastAsia="zh-CN"/>
+        </w:rPr>
+        <w:t>:</w:t>
+      </w:r>
+    </w:p>
+    <w:p>
+      <w:pPr>
+        <w:rPr>
           <w:rFonts w:hint="eastAsia"/>
           <w:highlight w:val="cyan"/>
           <w:lang w:eastAsia="zh-CN"/>
         </w:rPr>
       </w:pPr>
+      <w:r>
+        <w:rPr>
+          <w:noProof/>
+          <w:lang w:eastAsia="zh-CN"/>
+        </w:rPr>
+        <w:drawing>
+          <wp:inline distT="0" distB="0" distL="0" distR="0" wp14:anchorId="2BDA3764" wp14:editId="140D1FA4">
+            <wp:extent cx="4269508" cy="5693308"/>
+            <wp:effectExtent l="0" t="6985" r="0" b="0"/>
+            <wp:docPr id="1542396426" name="Picture 4"/>
+            <wp:cNvGraphicFramePr>
+              <a:graphicFrameLocks xmlns:a="http://schemas.openxmlformats.org/drawingml/2006/main" noChangeAspect="1"/>
+            </wp:cNvGraphicFramePr>
+            <a:graphic xmlns:a="http://schemas.openxmlformats.org/drawingml/2006/main">
+              <a:graphicData uri="http://schemas.openxmlformats.org/drawingml/2006/picture">
+                <pic:pic xmlns:pic="http://schemas.openxmlformats.org/drawingml/2006/picture">
+                  <pic:nvPicPr>
+                    <pic:cNvPr id="0" name="Picture 2"/>
+                    <pic:cNvPicPr>
+                      <a:picLocks noChangeAspect="1" noChangeArrowheads="1"/>
+                    </pic:cNvPicPr>
+                  </pic:nvPicPr>
+                  <pic:blipFill>
+                    <a:blip r:embed="rId16" cstate="print">
+                      <a:extLst>
+                        <a:ext uri="{28A0092B-C50C-407E-A947-70E740481C1C}">
+                          <a14:useLocalDpi xmlns:a14="http://schemas.microsoft.com/office/drawing/2010/main" val="0"/>
+                        </a:ext>
+                      </a:extLst>
+                    </a:blip>
+                    <a:srcRect/>
+                    <a:stretch>
+                      <a:fillRect/>
+                    </a:stretch>
+                  </pic:blipFill>
+                  <pic:spPr bwMode="auto">
+                    <a:xfrm rot="16200000">
+                      <a:off x="0" y="0"/>
+                      <a:ext cx="4282623" cy="5710797"/>
+                    </a:xfrm>
+                    <a:prstGeom prst="rect">
+                      <a:avLst/>
+                    </a:prstGeom>
+                    <a:noFill/>
+                    <a:ln>
+                      <a:noFill/>
+                    </a:ln>
+                  </pic:spPr>
+                </pic:pic>
+              </a:graphicData>
+            </a:graphic>
+          </wp:inline>
+        </w:drawing>
+      </w:r>
+    </w:p>
+    <w:p>
+      <w:pPr>
+        <w:rPr>
+          <w:highlight w:val="cyan"/>
+          <w:lang w:eastAsia="zh-CN"/>
+        </w:rPr>
+      </w:pPr>
+    </w:p>
+    <w:p>
+      <w:pPr>
+        <w:rPr>
+          <w:b/>
+          <w:bCs/>
+          <w:lang w:eastAsia="zh-CN"/>
+        </w:rPr>
+      </w:pPr>
+      <w:r>
+        <w:rPr>
+          <w:rFonts w:hint="eastAsia"/>
+          <w:b/>
+          <w:bCs/>
+          <w:lang w:eastAsia="zh-CN"/>
+        </w:rPr>
+        <w:t xml:space="preserve">Task </w:t>
+      </w:r>
+      <w:r>
+        <w:rPr>
+          <w:rFonts w:hint="eastAsia"/>
+          <w:b/>
+          <w:bCs/>
+          <w:lang w:eastAsia="zh-CN"/>
+        </w:rPr>
+        <w:t>4</w:t>
+      </w:r>
+      <w:r>
+        <w:rPr>
+          <w:rFonts w:hint="eastAsia"/>
+          <w:b/>
+          <w:bCs/>
+          <w:lang w:eastAsia="zh-CN"/>
+        </w:rPr>
+        <w:t>:</w:t>
+      </w:r>
+    </w:p>
+    <w:p>
+      <w:pPr>
+        <w:rPr>
+          <w:lang w:eastAsia="zh-CN"/>
+        </w:rPr>
+      </w:pPr>
+      <w:r>
+        <w:rPr>
+          <w:lang w:eastAsia="zh-CN"/>
+        </w:rPr>
+        <w:t>During this project, one of the main challenges was making MATLAB, Arduino, the temperature sensor and LEDs work together reliably. At the beginning, some of the biggest problems were hardware related rather than programming related. For example, incorrect wiring or unstable sensor readings could make the output look wrong even when the code structure was correct. This meant I had to test the system step by step, first checking Arduino communication, then LED output, then temperature readings, before combining everything into the full program.</w:t>
+      </w:r>
+    </w:p>
+    <w:p>
+      <w:pPr>
+        <w:rPr>
+          <w:lang w:eastAsia="zh-CN"/>
+        </w:rPr>
+      </w:pPr>
+    </w:p>
+    <w:p>
+      <w:pPr>
+        <w:rPr>
+          <w:lang w:eastAsia="zh-CN"/>
+        </w:rPr>
+      </w:pPr>
+      <w:r>
+        <w:rPr>
+          <w:lang w:eastAsia="zh-CN"/>
+        </w:rPr>
+        <w:t>A strength of the project is that it successfully combines data acquisition, live monitoring and decision making. The code can read the temperature sensor, convert voltage into temperature, display the temperature data and control the LEDs according to the required conditions. I also used functions for the later tasks, which made the program more organised and easier to read. Adding comments throughout the code improved clarity and made it easier to understand each part of the system.</w:t>
+      </w:r>
+    </w:p>
+    <w:p>
+      <w:pPr>
+        <w:rPr>
+          <w:lang w:eastAsia="zh-CN"/>
+        </w:rPr>
+      </w:pPr>
+    </w:p>
+    <w:p>
+      <w:pPr>
+        <w:rPr>
+          <w:lang w:eastAsia="zh-CN"/>
+        </w:rPr>
+      </w:pPr>
+      <w:r>
+        <w:rPr>
+          <w:lang w:eastAsia="zh-CN"/>
+        </w:rPr>
+        <w:lastRenderedPageBreak/>
+        <w:t>One improvement I made was extending the temperature prediction task to use two sensors instead of one. By connecting a second sensor to A1 and averaging the readings from both sensors, I was able to reduce the effect of random noise and make the temperature trend more stable. This was a useful innovation because the prediction in Task 3 depends strongly on the rate of change of temperature, so more stable input data gives more reasonable results. I think this made the system more reliable than using only a single sensor.</w:t>
+      </w:r>
+    </w:p>
+    <w:p>
+      <w:pPr>
+        <w:rPr>
+          <w:rFonts w:hint="eastAsia"/>
+          <w:lang w:eastAsia="zh-CN"/>
+        </w:rPr>
+      </w:pPr>
+    </w:p>
+    <w:p>
+      <w:pPr>
+        <w:rPr>
+          <w:lang w:eastAsia="zh-CN"/>
+        </w:rPr>
+      </w:pPr>
+      <w:r>
+        <w:rPr>
+          <w:lang w:eastAsia="zh-CN"/>
+        </w:rPr>
+        <w:t>There are also some limitations. The temperature readings were still sometimes noisy, which could affect the prediction task and produce unrealistic future temperatures if the rate of change changed suddenly. Although averaging and smoothing helped, the prediction is still only an estimate. Another limitation is that the system only uses basic temperature limits and simple sensors, so it is not as accurate or as reliable as a real aerospace monitoring system.</w:t>
+      </w:r>
+    </w:p>
+    <w:p>
+      <w:pPr>
+        <w:rPr>
+          <w:lang w:eastAsia="zh-CN"/>
+        </w:rPr>
+      </w:pPr>
+    </w:p>
+    <w:p>
+      <w:pPr>
+        <w:rPr>
+          <w:rFonts w:hint="eastAsia"/>
+          <w:lang w:eastAsia="zh-CN"/>
+        </w:rPr>
+      </w:pPr>
+      <w:r>
+        <w:rPr>
+          <w:lang w:eastAsia="zh-CN"/>
+        </w:rPr>
+        <w:t xml:space="preserve">If I improved this project further, I would use a better filtering method for the sensor data and improve the prediction </w:t>
+      </w:r>
+      <w:proofErr w:type="gramStart"/>
+      <w:r>
+        <w:rPr>
+          <w:lang w:eastAsia="zh-CN"/>
+        </w:rPr>
+        <w:t>model</w:t>
+      </w:r>
+      <w:proofErr w:type="gramEnd"/>
+      <w:r>
+        <w:rPr>
+          <w:lang w:eastAsia="zh-CN"/>
+        </w:rPr>
+        <w:t xml:space="preserve"> so it is less sensitive to noise</w:t>
+      </w:r>
+      <w:r>
+        <w:rPr>
+          <w:rFonts w:hint="eastAsia"/>
+          <w:lang w:eastAsia="zh-CN"/>
+        </w:rPr>
+        <w:t>.</w:t>
+      </w:r>
+      <w:r>
+        <w:rPr>
+          <w:lang w:eastAsia="zh-CN"/>
+        </w:rPr>
+        <w:t xml:space="preserve"> I would also make the graph and screen output clearer and easier to read. Finally, I would improve the hardware connection and testing </w:t>
+      </w:r>
+      <w:proofErr w:type="gramStart"/>
+      <w:r>
+        <w:rPr>
+          <w:lang w:eastAsia="zh-CN"/>
+        </w:rPr>
+        <w:t>setup</w:t>
+      </w:r>
+      <w:proofErr w:type="gramEnd"/>
+      <w:r>
+        <w:rPr>
+          <w:lang w:eastAsia="zh-CN"/>
+        </w:rPr>
+        <w:t xml:space="preserve"> so the whole system works more reliably during longer tests.</w:t>
+      </w:r>
     </w:p>
     <w:sectPr>
-      <w:headerReference w:type="even" r:id="rId11"/>
-      <w:headerReference w:type="default" r:id="rId12"/>
-      <w:footerReference w:type="even" r:id="rId13"/>
-      <w:footerReference w:type="default" r:id="rId14"/>
-      <w:headerReference w:type="first" r:id="rId15"/>
-      <w:footerReference w:type="first" r:id="rId16"/>
+      <w:headerReference w:type="even" r:id="rId17"/>
+      <w:headerReference w:type="default" r:id="rId18"/>
+      <w:footerReference w:type="even" r:id="rId19"/>
+      <w:footerReference w:type="default" r:id="rId20"/>
+      <w:headerReference w:type="first" r:id="rId21"/>
+      <w:footerReference w:type="first" r:id="rId22"/>
       <w:pgSz w:w="11906" w:h="16838"/>
       <w:pgMar w:top="1440" w:right="1440" w:bottom="1440" w:left="1440" w:header="850" w:footer="708" w:gutter="0"/>
       <w:cols w:space="708"/>
@@ -1728,7 +2357,6 @@
   <w:style w:type="character" w:default="1" w:styleId="DefaultParagraphFont">
     <w:name w:val="Default Paragraph Font"/>
     <w:uiPriority w:val="1"/>
-    <w:semiHidden/>
     <w:unhideWhenUsed/>
   </w:style>
   <w:style w:type="table" w:default="1" w:styleId="TableNormal">

</xml_diff>